<commit_message>
Viveris : C ajouté au profil, « bases en développement », tous les langages en notions
Co-Authored-By: Claude Opus 5.5 <noreply@anthropic.com>
Claude-Session: https://claude.ai/code/session_01Uwm2tAGtUGTnWWMUSVQkub
</commit_message>
<xml_diff>
--- a/output/CV_NicolasQiGUO_Viveris.docx
+++ b/output/CV_NicolasQiGUO_Viveris.docx
@@ -144,7 +144,7 @@
           <w:sz w:val="19"/>
           <w:u w:val="none"/>
         </w:rPr>
-        <w:t>3 ans d'expérience au sein de grands groupes (BNP Paribas, La Poste). Pilotage de projets de bout en bout, coordination transverse Métiers–IT, gouvernance et conduite du changement. Double compétence fonctionnelle et technique : développement applicatif (projets académiques en Java, C#, PHP, SQL) et low-code (Power Platform).</w:t>
+        <w:t>3 ans d'expérience au sein de grands groupes (BNP Paribas, La Poste). Pilotage de projets de bout en bout, coordination transverse Métiers–IT, gouvernance et conduite du changement. Double compétence fonctionnelle et technique : bases en développement applicatif (projets académiques en Java, C#, C, PHP, SQL) et low-code (Power Platform).</w:t>
       </w:r>
     </w:p>
     <w:p>
@@ -1395,7 +1395,7 @@
           <w:sz w:val="19"/>
           <w:u w:val="none"/>
         </w:rPr>
-        <w:t>Développement :</w:t>
+        <w:t>Langages (notions) :</w:t>
       </w:r>
       <w:r>
         <w:rPr>
@@ -1407,7 +1407,7 @@
           <w:u w:val="none"/>
         </w:rPr>
         <w:tab/>
-        <w:t>Java, C#, C, PHP, HTML/CSS, SQL (PostgreSQL, Oracle) ; Python (notions)</w:t>
+        <w:t>Java, C#, C, PHP, HTML/CSS, SQL (PostgreSQL, Oracle), Python</w:t>
       </w:r>
     </w:p>
     <w:p>

</xml_diff>

<commit_message>
Viveris : low-code en tête de la double compétence, site e-commerce
Co-Authored-By: Claude Opus 5.5 <noreply@anthropic.com>
Claude-Session: https://claude.ai/code/session_01Uwm2tAGtUGTnWWMUSVQkub
</commit_message>
<xml_diff>
--- a/output/CV_NicolasQiGUO_Viveris.docx
+++ b/output/CV_NicolasQiGUO_Viveris.docx
@@ -144,7 +144,7 @@
           <w:sz w:val="19"/>
           <w:u w:val="none"/>
         </w:rPr>
-        <w:t>3 ans d'expérience au sein de grands groupes (BNP Paribas, La Poste). Pilotage de projets de bout en bout, coordination transverse Métiers–IT, gouvernance et conduite du changement. Double compétence fonctionnelle et technique : bases en développement applicatif (projets académiques en Java, C#, C, PHP, SQL) et low-code (Power Platform).</w:t>
+        <w:t>3 ans d'expérience au sein de grands groupes (BNP Paribas, La Poste). Pilotage de projets de bout en bout, coordination transverse Métiers–IT, gouvernance et conduite du changement. Double compétence fonctionnelle et technique : développement low-code (Power Platform) et pratique du développement applicatif en projets académiques (Java, C#, C, PHP, SQL).</w:t>
       </w:r>
     </w:p>
     <w:p>
@@ -1073,7 +1073,7 @@
           <w:sz w:val="18"/>
           <w:u w:val="none"/>
         </w:rPr>
-        <w:t>Projets : e-commerce (PHP/HTML/CSS), BDD médicale (PostgreSQL/Oracle), jeux (Java/C#), calcul d'impôt (C)</w:t>
+        <w:t>Projets : site e-commerce (PHP), BDD médicale (PostgreSQL/Oracle), jeux (Java/C#), calcul d'impôt (C)</w:t>
       </w:r>
     </w:p>
     <w:p>

</xml_diff>

<commit_message>
Viveris : « Projets de développement », SQL sans nom de SGBD
Co-Authored-By: Claude Opus 5.5 <noreply@anthropic.com>
Claude-Session: https://claude.ai/code/session_01Uwm2tAGtUGTnWWMUSVQkub
</commit_message>
<xml_diff>
--- a/output/CV_NicolasQiGUO_Viveris.docx
+++ b/output/CV_NicolasQiGUO_Viveris.docx
@@ -1073,7 +1073,7 @@
           <w:sz w:val="18"/>
           <w:u w:val="none"/>
         </w:rPr>
-        <w:t>Projets : site e-commerce (PHP), BDD médicale (PostgreSQL/Oracle), jeux (Java/C#), calcul d'impôt (C)</w:t>
+        <w:t>Projets de développement : site e-commerce (PHP), BDD médicale (SQL), jeux (Java/C#), calcul d'impôt (C)</w:t>
       </w:r>
     </w:p>
     <w:p>
@@ -1407,7 +1407,7 @@
           <w:u w:val="none"/>
         </w:rPr>
         <w:tab/>
-        <w:t>Java, C#, C, PHP, HTML/CSS, SQL (PostgreSQL, Oracle), Python</w:t>
+        <w:t>Java, C#, C, PHP, HTML/CSS, SQL, Python</w:t>
       </w:r>
     </w:p>
     <w:p>

</xml_diff>